<commit_message>
Einsingen: Block A auf die abgelesenen Tonhoehen von Nr. 11 stellen
Die Chorstelle Takt 7-8 von "When I Survey" wurde aus der Partitur
vermessen statt rekonstruiert: Tenor und Bass unisono, D3 D3 E3 |
F#3 E3 F#3, pp, a tempo, D-Dur, Umfang eine grosse Terz, rein
stufenweise. Beleg fuer das Unisono ist der konstante Stufenabstand
von 5 zwischen Tenor- und Basssystem.

- Block A beginnt jetzt mit A2 "Das Original - woertlich" (Maenner wie
  notiert, Frauen 8va, ohne Noten) und adaptiert erst danach:
  A3 halbtonweise transponiert, A4 erweitert zur Fuenftonleiter,
  A5 zurueck zum Text mit Konsonanten.
- 13-Minuten-Fassung fuer den 12.09. entsprechend neu: A1 A2 A3 B1 B2 A3,
  Ende in A-Dur nur mit Tenor und Bass fuer den Einsatz in Nr. 6 T. 3.
- PDF und Word neu gebaut, Stueckblatt Nr. 11 um den Befund ergaenzt.

Co-Authored-By: Claude Opus 5 <noreply@anthropic.com>
Claude-Session: https://claude.ai/code/session_01GftfN2ZbR4hJMi8K4sLu7a
</commit_message>
<xml_diff>
--- a/probenplanung/05_Einsingen/Einsingen_Bausteine.docx
+++ b/probenplanung/05_Einsingen/Einsingen_Bausteine.docx
@@ -110,7 +110,7 @@
           <w:sz w:val="19"/>
           <w:szCs w:val="19"/>
         </w:rPr>
-        <w:t xml:space="preserve">Alle Übungen sind in Tonstufen notiert (1 = Grundton), nicht in absoluten Tönen — so sind sie halbtonweise verschiebbar. Die Rhythmen sind exakt aus den Partituren übernommen.</w:t>
+        <w:t xml:space="preserve">Alle Übungen sind in Tonstufen notiert (1 = Grundton), nicht in absoluten Tönen — so sind sie halbtonweise verschiebbar. Block A beginnt mit der wörtlichen Stelle — Tonhöhen und Rhythmus aus der Partitur abgelesen — und weitet sie dann schrittweise. Was zuerst im Original gesungen wird, prägt sich als Klangbild ein; alles Weitere hängt sich daran. Ab A3 stehen zusätzlich die Tonstufen (1 = Grundton), damit halbtonweise transponiert werden kann.</w:t>
       </w:r>
     </w:p>
     <w:p>
@@ -152,7 +152,7 @@
           <w:sz w:val="15"/>
           <w:szCs w:val="15"/>
         </w:rPr>
-        <w:t xml:space="preserve">Block A · rund 11 Minuten</w:t>
+        <w:t xml:space="preserve">Block A · rund 13 Minuten</w:t>
       </w:r>
     </w:p>
     <w:p>
@@ -229,7 +229,7 @@
           <w:sz w:val="19"/>
           <w:szCs w:val="19"/>
         </w:rPr>
-        <w:t xml:space="preserve">Der Chor beginnt mit Tenor und Bass allein, pp, „a tempo“. Die Bewegung läuft ausschließlich stufenweise in engem Raum, über dem gehaltenen „the“ steht eine Schwell-Gabel. Genau diese drei Eigenschaften machen die Stelle zur idealen Einsingvorlage. D-Dur.</w:t>
+        <w:t xml:space="preserve">Der Chor beginnt mit Tenor und Bass — und zwar unisono, pp, „a tempo“. D-Dur. Tonhöhen und Rhythmus aus der Partitur abgelesen:</w:t>
       </w:r>
     </w:p>
     <w:p>
@@ -256,7 +256,7 @@
           <w:sz w:val="18"/>
           <w:szCs w:val="18"/>
         </w:rPr>
-        <w:t xml:space="preserve">Zeichen:  ♩ Viertel   ♩— Halbe   ♪ Achtel   ‿ gebunden   – Pause</w:t>
+        <w:t xml:space="preserve">Zeichen:  ♩ Viertel   ♩— Halbe   ‿ gebunden   – Pause      (klingende Tonhöhen)</w:t>
       </w:r>
     </w:p>
     <w:p>
@@ -310,7 +310,7 @@
           <w:sz w:val="18"/>
           <w:szCs w:val="18"/>
         </w:rPr>
-        <w:t xml:space="preserve"> –      ♩      ♩      ♩    │    ♩—         ♩  ‿  ♩</w:t>
+        <w:t xml:space="preserve">        Takt 7                   │   Takt 8</w:t>
       </w:r>
     </w:p>
     <w:p>
@@ -337,7 +337,88 @@
           <w:sz w:val="18"/>
           <w:szCs w:val="18"/>
         </w:rPr>
-        <w:t xml:space="preserve">      When     I    sur-       vey        the  ——  ——</w:t>
+        <w:t xml:space="preserve">   –      ♩      ♩      ♩        │    ♩—          ♩   ‿   ♩</w:t>
+      </w:r>
+    </w:p>
+    <w:p>
+      <w:pPr>
+        <w:pBdr>
+          <w:top w:val="none" w:color="FFFFFF" w:sz="0"/>
+          <w:bottom w:val="none" w:color="FFFFFF" w:sz="0"/>
+          <w:left w:val="single" w:color="7A2C63" w:sz="18"/>
+          <w:right w:val="none" w:color="FFFFFF" w:sz="0"/>
+        </w:pBdr>
+        <w:shd w:fill="F0EBEF" w:val="clear"/>
+        <w:spacing w:after="0" w:before="0" w:line="250"/>
+        <w:ind w:left="140" w:right="140"/>
+      </w:pPr>
+      <w:r>
+        <w:rPr>
+          <w:rFonts w:ascii="Consolas" w:cs="Consolas" w:eastAsia="Consolas" w:hAnsi="Consolas"/>
+          <w:b w:val="false"/>
+          <w:bCs w:val="false"/>
+          <w:i w:val="false"/>
+          <w:iCs w:val="false"/>
+          <w:caps w:val="false"/>
+          <w:color w:val="231B27"/>
+          <w:sz w:val="18"/>
+          <w:szCs w:val="18"/>
+        </w:rPr>
+        <w:t xml:space="preserve">         D3     D3     E3        │   F#3          E3      F#3</w:t>
+      </w:r>
+    </w:p>
+    <w:p>
+      <w:pPr>
+        <w:pBdr>
+          <w:top w:val="none" w:color="FFFFFF" w:sz="0"/>
+          <w:bottom w:val="none" w:color="FFFFFF" w:sz="0"/>
+          <w:left w:val="single" w:color="7A2C63" w:sz="18"/>
+          <w:right w:val="none" w:color="FFFFFF" w:sz="0"/>
+        </w:pBdr>
+        <w:shd w:fill="F0EBEF" w:val="clear"/>
+        <w:spacing w:after="0" w:before="0" w:line="250"/>
+        <w:ind w:left="140" w:right="140"/>
+      </w:pPr>
+      <w:r>
+        <w:rPr>
+          <w:rFonts w:ascii="Consolas" w:cs="Consolas" w:eastAsia="Consolas" w:hAnsi="Consolas"/>
+          <w:b w:val="false"/>
+          <w:bCs w:val="false"/>
+          <w:i w:val="false"/>
+          <w:iCs w:val="false"/>
+          <w:caps w:val="false"/>
+          <w:color w:val="231B27"/>
+          <w:sz w:val="18"/>
+          <w:szCs w:val="18"/>
+        </w:rPr>
+        <w:t xml:space="preserve">        When     I    sur-       │   vey          the  ————</w:t>
+      </w:r>
+    </w:p>
+    <w:p>
+      <w:pPr>
+        <w:pBdr>
+          <w:top w:val="none" w:color="FFFFFF" w:sz="0"/>
+          <w:bottom w:val="none" w:color="FFFFFF" w:sz="0"/>
+          <w:left w:val="single" w:color="7A2C63" w:sz="18"/>
+          <w:right w:val="none" w:color="FFFFFF" w:sz="0"/>
+        </w:pBdr>
+        <w:shd w:fill="F0EBEF" w:val="clear"/>
+        <w:spacing w:after="0" w:before="0" w:line="250"/>
+        <w:ind w:left="140" w:right="140"/>
+      </w:pPr>
+      <w:r>
+        <w:rPr>
+          <w:rFonts w:ascii="Consolas" w:cs="Consolas" w:eastAsia="Consolas" w:hAnsi="Consolas"/>
+          <w:b w:val="false"/>
+          <w:bCs w:val="false"/>
+          <w:i w:val="false"/>
+          <w:iCs w:val="false"/>
+          <w:caps w:val="false"/>
+          <w:color w:val="231B27"/>
+          <w:sz w:val="18"/>
+          <w:szCs w:val="18"/>
+        </w:rPr>
+        <w:t xml:space="preserve">Stufe    1      1      2         │    3            2       3</w:t>
       </w:r>
     </w:p>
     <w:p>
@@ -364,7 +445,59 @@
           <w:sz w:val="18"/>
           <w:szCs w:val="18"/>
         </w:rPr>
-        <w:t xml:space="preserve">                              &lt;—— cresc. —— decresc. ——&gt;</w:t>
+        <w:t xml:space="preserve">                                    &lt;—— cresc. —— decresc. ——&gt;</w:t>
+      </w:r>
+    </w:p>
+    <w:p>
+      <w:pPr>
+        <w:spacing w:after="90" w:before="0" w:line="255"/>
+      </w:pPr>
+      <w:r>
+        <w:rPr>
+          <w:rFonts w:ascii="Calibri" w:cs="Calibri" w:eastAsia="Calibri" w:hAnsi="Calibri"/>
+          <w:b/>
+          <w:bCs/>
+          <w:i w:val="false"/>
+          <w:iCs w:val="false"/>
+          <w:caps w:val="false"/>
+          <w:color w:val="231B27"/>
+          <w:sz w:val="19"/>
+          <w:szCs w:val="19"/>
+        </w:rPr>
+        <w:t xml:space="preserve">Umfang: D3 bis F#3 — eine große Terz, rein stufenweise, kein einziger Sprung. </w:t>
+      </w:r>
+      <w:r>
+        <w:rPr>
+          <w:rFonts w:ascii="Calibri" w:cs="Calibri" w:eastAsia="Calibri" w:hAnsi="Calibri"/>
+          <w:b w:val="false"/>
+          <w:bCs w:val="false"/>
+          <w:i w:val="false"/>
+          <w:iCs w:val="false"/>
+          <w:caps w:val="false"/>
+          <w:color w:val="231B27"/>
+          <w:sz w:val="19"/>
+          <w:szCs w:val="19"/>
+        </w:rPr>
+        <w:t xml:space="preserve">Dazu pp und eine Schwell-Gabel über dem gehaltenen „the“. Eine bessere Einsingvorlage kann man nicht erfinden; sie steht bereits in den Noten.</w:t>
+      </w:r>
+    </w:p>
+    <w:p>
+      <w:pPr>
+        <w:spacing w:after="90" w:before="0" w:line="255"/>
+      </w:pPr>
+      <w:r>
+        <w:rPr>
+          <w:rFonts w:ascii="Calibri" w:cs="Calibri" w:eastAsia="Calibri" w:hAnsi="Calibri"/>
+          <w:b w:val="false"/>
+          <w:bCs w:val="false"/>
+          <w:i/>
+          <w:iCs/>
+          <w:caps w:val="false"/>
+          <w:color w:val="584C5D"/>
+          <w:sz w:val="18"/>
+          <w:szCs w:val="18"/>
+        </w:rPr>
+        <w:t xml:space="preserve">Nachgelesen, nicht rekonstruiert: Die Notenköpfe wurden gegen die Notenlinien vermessen; Tenor und Bass stehen durchgehend fünf Stufen auseinander, was bei Violinschlüssel-8 gegen Bassschlüssel genau Unisono bedeutet.</w:t>
       </w:r>
     </w:p>
     <w:p>
@@ -626,7 +759,7 @@
           <w:sz w:val="21"/>
           <w:szCs w:val="21"/>
         </w:rPr>
-        <w:t xml:space="preserve">Der Bogen auf einem Ton</w:t>
+        <w:t xml:space="preserve">Das Original — wörtlich</w:t>
       </w:r>
       <w:r>
         <w:rPr>
@@ -659,7 +792,7 @@
           <w:sz w:val="19"/>
           <w:szCs w:val="19"/>
         </w:rPr>
-        <w:t xml:space="preserve">Der Rhythmus aus Takt 7–8, auf einer Tonhöhe, Silbe „nu“ oder „wo“. Alles in einem Atem.</w:t>
+        <w:t xml:space="preserve">Hier wird angefangen. Die Stelle genau wie notiert, in D-Dur, auf den Text. Männer wie in den Noten, Frauen eine Oktave höher — dann singen alle dieselbe Melodie.</w:t>
       </w:r>
     </w:p>
     <w:p>
@@ -686,7 +819,7 @@
           <w:sz w:val="18"/>
           <w:szCs w:val="18"/>
         </w:rPr>
-        <w:t xml:space="preserve"> ♩     ♩     ♩    │    ♩—        ♩  ‿  ♩</w:t>
+        <w:t xml:space="preserve">Männer (wie notiert)   D3   D3   E3  │  F#3        E3 ‿ F#3</w:t>
       </w:r>
     </w:p>
     <w:p>
@@ -713,7 +846,7 @@
           <w:sz w:val="18"/>
           <w:szCs w:val="18"/>
         </w:rPr>
-        <w:t xml:space="preserve"> nu    nu    nu        nu         u  ——  ——</w:t>
+        <w:t xml:space="preserve">Frauen (8va höher)     D4   D4   E4  │  F#4        E4 ‿ F#4</w:t>
       </w:r>
     </w:p>
     <w:p>
@@ -740,7 +873,7 @@
           <w:sz w:val="18"/>
           <w:szCs w:val="18"/>
         </w:rPr>
-        <w:t xml:space="preserve">                      &lt;——— cresc. ——— decresc. ———&gt;</w:t>
+        <w:t xml:space="preserve">                      When   I   sur-   vey        the ————</w:t>
       </w:r>
     </w:p>
     <w:p>
@@ -759,7 +892,7 @@
           <w:sz w:val="18"/>
           <w:szCs w:val="18"/>
         </w:rPr>
-        <w:t xml:space="preserve">Halbtonweise aufwärts, etwa fünf bis sechs Stufen, dann zurück. Langsam, Viertel = 60.</w:t>
+        <w:t xml:space="preserve">Erst vorsingen oder auf dem Klavier spielen, dann nachsingen — ohne Noten. Zwei, drei Wiederholungen, bis es steht. Langsam, ♩ = 60, alles in einem Atem, pp mit der Schwell-Gabel auf dem gehaltenen „the“.</w:t>
       </w:r>
     </w:p>
     <w:p>
@@ -800,7 +933,7 @@
           <w:sz w:val="18"/>
           <w:szCs w:val="18"/>
         </w:rPr>
-        <w:t xml:space="preserve">Die Dynamik kommt aus dem Atem, nicht aus dem Hals. Das cresc. entsteht durch mehr Fluss, nicht durch mehr Druck.</w:t>
+        <w:t xml:space="preserve">Das Klangbild der Originalstelle setzen. Alles Folgende hängt sich daran — und wenn Nr. 11 am Nachmittag drankommt, ist die Figur schon im Ohr.</w:t>
       </w:r>
     </w:p>
     <w:p>
@@ -841,7 +974,7 @@
           <w:sz w:val="18"/>
           <w:szCs w:val="18"/>
         </w:rPr>
-        <w:t xml:space="preserve">„Der Ton wird nicht lauter, er wird weiter.“</w:t>
+        <w:t xml:space="preserve">„Das ist keine Übung, das sind die ersten Töne, die der Chor heute Nachmittag singt. Merkt sie euch.“</w:t>
       </w:r>
     </w:p>
     <w:p>
@@ -874,7 +1007,7 @@
           <w:sz w:val="21"/>
           <w:szCs w:val="21"/>
         </w:rPr>
-        <w:t xml:space="preserve">Die Fünftonleiter, ein Atem</w:t>
+        <w:t xml:space="preserve">Dieselbe Figur, halbtonweise aufwärts</w:t>
       </w:r>
       <w:r>
         <w:rPr>
@@ -888,7 +1021,7 @@
           <w:sz w:val="17"/>
           <w:szCs w:val="17"/>
         </w:rPr>
-        <w:t xml:space="preserve">      4 Min.</w:t>
+        <w:t xml:space="preserve">      3 Min.</w:t>
       </w:r>
     </w:p>
     <w:p>
@@ -907,7 +1040,7 @@
           <w:sz w:val="19"/>
           <w:szCs w:val="19"/>
         </w:rPr>
-        <w:t xml:space="preserve">Weil sich die Melodie ausschließlich stufenweise bewegt, ist die Fünftonleiter das passende Material — nicht der Dreiklang.</w:t>
+        <w:t xml:space="preserve">Jetzt transponieren — der Text bleibt, die Tonart wandert. Auf „nu“ oder „wo“, wenn der Text stört.</w:t>
       </w:r>
     </w:p>
     <w:p>
@@ -934,7 +1067,88 @@
           <w:sz w:val="18"/>
           <w:szCs w:val="18"/>
         </w:rPr>
-        <w:t xml:space="preserve">1 – 2 – 3 – 4 – 5 – 4 – 3 – 2 – 1</w:t>
+        <w:t xml:space="preserve">Stufe   1    1    2   │   3         2  ‿  3</w:t>
+      </w:r>
+    </w:p>
+    <w:p>
+      <w:pPr>
+        <w:pBdr>
+          <w:top w:val="none" w:color="FFFFFF" w:sz="0"/>
+          <w:bottom w:val="none" w:color="FFFFFF" w:sz="0"/>
+          <w:left w:val="single" w:color="7A2C63" w:sz="18"/>
+          <w:right w:val="none" w:color="FFFFFF" w:sz="0"/>
+        </w:pBdr>
+        <w:shd w:fill="F0EBEF" w:val="clear"/>
+        <w:spacing w:after="0" w:before="0" w:line="250"/>
+        <w:ind w:left="140" w:right="140"/>
+      </w:pPr>
+      <w:r>
+        <w:rPr>
+          <w:rFonts w:ascii="Consolas" w:cs="Consolas" w:eastAsia="Consolas" w:hAnsi="Consolas"/>
+          <w:b w:val="false"/>
+          <w:bCs w:val="false"/>
+          <w:i w:val="false"/>
+          <w:iCs w:val="false"/>
+          <w:caps w:val="false"/>
+          <w:color w:val="231B27"/>
+          <w:sz w:val="18"/>
+          <w:szCs w:val="18"/>
+        </w:rPr>
+        <w:t xml:space="preserve">        nu   nu   nu      nu        u  ——  ——</w:t>
+      </w:r>
+    </w:p>
+    <w:p>
+      <w:pPr>
+        <w:pBdr>
+          <w:top w:val="none" w:color="FFFFFF" w:sz="0"/>
+          <w:bottom w:val="none" w:color="FFFFFF" w:sz="0"/>
+          <w:left w:val="single" w:color="7A2C63" w:sz="18"/>
+          <w:right w:val="none" w:color="FFFFFF" w:sz="0"/>
+        </w:pBdr>
+        <w:shd w:fill="F0EBEF" w:val="clear"/>
+        <w:spacing w:after="0" w:before="0" w:line="250"/>
+        <w:ind w:left="140" w:right="140"/>
+      </w:pPr>
+      <w:r>
+        <w:rPr>
+          <w:rFonts w:ascii="Consolas" w:cs="Consolas" w:eastAsia="Consolas" w:hAnsi="Consolas"/>
+          <w:b w:val="false"/>
+          <w:bCs w:val="false"/>
+          <w:i w:val="false"/>
+          <w:iCs w:val="false"/>
+          <w:caps w:val="false"/>
+          <w:color w:val="231B27"/>
+          <w:sz w:val="18"/>
+          <w:szCs w:val="18"/>
+        </w:rPr>
+        <w:t xml:space="preserve">                         &lt;——— cresc. ——— decresc. ———&gt;</w:t>
+      </w:r>
+    </w:p>
+    <w:p>
+      <w:pPr>
+        <w:pBdr>
+          <w:top w:val="none" w:color="FFFFFF" w:sz="0"/>
+          <w:bottom w:val="none" w:color="FFFFFF" w:sz="0"/>
+          <w:left w:val="single" w:color="7A2C63" w:sz="18"/>
+          <w:right w:val="none" w:color="FFFFFF" w:sz="0"/>
+        </w:pBdr>
+        <w:shd w:fill="F0EBEF" w:val="clear"/>
+        <w:spacing w:after="0" w:before="0" w:line="250"/>
+        <w:ind w:left="140" w:right="140"/>
+      </w:pPr>
+      <w:r>
+        <w:rPr>
+          <w:rFonts w:ascii="Consolas" w:cs="Consolas" w:eastAsia="Consolas" w:hAnsi="Consolas"/>
+          <w:b w:val="false"/>
+          <w:bCs w:val="false"/>
+          <w:i w:val="false"/>
+          <w:iCs w:val="false"/>
+          <w:caps w:val="false"/>
+          <w:color w:val="231B27"/>
+          <w:sz w:val="18"/>
+          <w:szCs w:val="18"/>
+        </w:rPr>
+        <w:t xml:space="preserve"/>
       </w:r>
     </w:p>
     <w:p>
@@ -961,7 +1175,7 @@
           <w:sz w:val="18"/>
           <w:szCs w:val="18"/>
         </w:rPr>
-        <w:t xml:space="preserve">no  no  no  no  no  no  no  no  no</w:t>
+        <w:t xml:space="preserve">Start  D-Dur  →  Es  →  E  →  F  →  Fis  →  G  →  As …</w:t>
       </w:r>
     </w:p>
     <w:p>
@@ -980,7 +1194,7 @@
           <w:sz w:val="18"/>
           <w:szCs w:val="18"/>
         </w:rPr>
-        <w:t xml:space="preserve">Legato, ein Atem, Viertel = 60. Halbtonweise aufwärts. Variante ab dem dritten Durchgang: auf der 5 eine Fermate mit Schwell-Gabel — das ist die Stelle aus Takt 8.</w:t>
+        <w:t xml:space="preserve">Etwa sechs bis acht Stufen aufwärts, dann in zwei, drei Schritten zurück. Immer ein Atem für die ganze Figur.</w:t>
       </w:r>
     </w:p>
     <w:p>
@@ -1021,7 +1235,7 @@
           <w:sz w:val="18"/>
           <w:szCs w:val="18"/>
         </w:rPr>
-        <w:t xml:space="preserve">Gleicher Klang auf allen fünf Stufen. Wo der Vokal kippt oder eng wird, sitzt später die Enge im Stück.</w:t>
+        <w:t xml:space="preserve">Der Chor merkt, dass die Figur überall gleich klingt — das ist der Beweis, dass sie im Atem sitzt und nicht im Hals.</w:t>
       </w:r>
     </w:p>
     <w:p>
@@ -1062,7 +1276,7 @@
           <w:sz w:val="18"/>
           <w:szCs w:val="18"/>
         </w:rPr>
-        <w:t xml:space="preserve">„Neun Töne, ein Atem, ein Vokal. Wenn der vierte anders klingt als der erste, habt ihr im Hals nachgeholfen.“</w:t>
+        <w:t xml:space="preserve">„Gleiche Figur, andere Höhe. Wenn sie oben anders klingt, habt ihr etwas anderes gemacht.“</w:t>
       </w:r>
     </w:p>
     <w:p>
@@ -1095,7 +1309,7 @@
           <w:sz w:val="21"/>
           <w:szCs w:val="21"/>
         </w:rPr>
-        <w:t xml:space="preserve">Mit Text</w:t>
+        <w:t xml:space="preserve">Erweitert: die Fünftonleiter</w:t>
       </w:r>
       <w:r>
         <w:rPr>
@@ -1109,6 +1323,227 @@
           <w:sz w:val="17"/>
           <w:szCs w:val="17"/>
         </w:rPr>
+        <w:t xml:space="preserve">      3 Min.</w:t>
+      </w:r>
+    </w:p>
+    <w:p>
+      <w:pPr>
+        <w:spacing w:after="90" w:before="0" w:line="255"/>
+      </w:pPr>
+      <w:r>
+        <w:rPr>
+          <w:rFonts w:ascii="Calibri" w:cs="Calibri" w:eastAsia="Calibri" w:hAnsi="Calibri"/>
+          <w:b w:val="false"/>
+          <w:bCs w:val="false"/>
+          <w:i w:val="false"/>
+          <w:iCs w:val="false"/>
+          <w:caps w:val="false"/>
+          <w:color w:val="231B27"/>
+          <w:sz w:val="19"/>
+          <w:szCs w:val="19"/>
+        </w:rPr>
+        <w:t xml:space="preserve">Jetzt die Adaption. Aus 1 – 1 – 2 – 3 – 2 – 3 wird die volle stufenweise Leiter — dieselbe Bewegungsart, größerer Raum. Deshalb die Fünftonleiter und nicht der Dreiklang: Die Melodie kennt keinen einzigen Sprung.</w:t>
+      </w:r>
+    </w:p>
+    <w:p>
+      <w:pPr>
+        <w:pBdr>
+          <w:top w:val="none" w:color="FFFFFF" w:sz="0"/>
+          <w:bottom w:val="none" w:color="FFFFFF" w:sz="0"/>
+          <w:left w:val="single" w:color="7A2C63" w:sz="18"/>
+          <w:right w:val="none" w:color="FFFFFF" w:sz="0"/>
+        </w:pBdr>
+        <w:shd w:fill="F0EBEF" w:val="clear"/>
+        <w:spacing w:after="0" w:before="70" w:line="250"/>
+        <w:ind w:left="140" w:right="140"/>
+      </w:pPr>
+      <w:r>
+        <w:rPr>
+          <w:rFonts w:ascii="Consolas" w:cs="Consolas" w:eastAsia="Consolas" w:hAnsi="Consolas"/>
+          <w:b w:val="false"/>
+          <w:bCs w:val="false"/>
+          <w:i w:val="false"/>
+          <w:iCs w:val="false"/>
+          <w:caps w:val="false"/>
+          <w:color w:val="231B27"/>
+          <w:sz w:val="18"/>
+          <w:szCs w:val="18"/>
+        </w:rPr>
+        <w:t xml:space="preserve">1 – 2 – 3 – 4 – 5 – 4 – 3 – 2 – 1</w:t>
+      </w:r>
+    </w:p>
+    <w:p>
+      <w:pPr>
+        <w:pBdr>
+          <w:top w:val="none" w:color="FFFFFF" w:sz="0"/>
+          <w:bottom w:val="none" w:color="FFFFFF" w:sz="0"/>
+          <w:left w:val="single" w:color="7A2C63" w:sz="18"/>
+          <w:right w:val="none" w:color="FFFFFF" w:sz="0"/>
+        </w:pBdr>
+        <w:shd w:fill="F0EBEF" w:val="clear"/>
+        <w:spacing w:after="110" w:before="0" w:line="250"/>
+        <w:ind w:left="140" w:right="140"/>
+      </w:pPr>
+      <w:r>
+        <w:rPr>
+          <w:rFonts w:ascii="Consolas" w:cs="Consolas" w:eastAsia="Consolas" w:hAnsi="Consolas"/>
+          <w:b w:val="false"/>
+          <w:bCs w:val="false"/>
+          <w:i w:val="false"/>
+          <w:iCs w:val="false"/>
+          <w:caps w:val="false"/>
+          <w:color w:val="231B27"/>
+          <w:sz w:val="18"/>
+          <w:szCs w:val="18"/>
+        </w:rPr>
+        <w:t xml:space="preserve">no  no  no  no  no  no  no  no  no</w:t>
+      </w:r>
+    </w:p>
+    <w:p>
+      <w:pPr>
+        <w:spacing w:after="90" w:before="0" w:line="255"/>
+      </w:pPr>
+      <w:r>
+        <w:rPr>
+          <w:rFonts w:ascii="Calibri" w:cs="Calibri" w:eastAsia="Calibri" w:hAnsi="Calibri"/>
+          <w:b w:val="false"/>
+          <w:bCs w:val="false"/>
+          <w:i w:val="false"/>
+          <w:iCs w:val="false"/>
+          <w:caps w:val="false"/>
+          <w:color w:val="584C5D"/>
+          <w:sz w:val="18"/>
+          <w:szCs w:val="18"/>
+        </w:rPr>
+        <w:t xml:space="preserve">Legato, ein Atem, ♩ = 60. Halbtonweise aufwärts. Variante ab dem dritten Durchgang: auf der 5 eine Fermate mit Schwell-Gabel — das ist die Gabel aus Takt 8, nur höher.</w:t>
+      </w:r>
+    </w:p>
+    <w:p>
+      <w:pPr>
+        <w:pBdr>
+          <w:top w:val="none" w:color="FFFFFF" w:sz="0"/>
+          <w:bottom w:val="none" w:color="FFFFFF" w:sz="0"/>
+          <w:left w:val="single" w:color="9C7728" w:sz="18"/>
+          <w:right w:val="none" w:color="FFFFFF" w:sz="0"/>
+        </w:pBdr>
+        <w:shd w:fill="F4EFE4" w:val="clear"/>
+        <w:spacing w:after="110" w:before="70" w:line="255"/>
+        <w:ind w:left="140" w:right="140"/>
+      </w:pPr>
+      <w:r>
+        <w:rPr>
+          <w:rFonts w:ascii="Consolas" w:cs="Consolas" w:eastAsia="Consolas" w:hAnsi="Consolas"/>
+          <w:b/>
+          <w:bCs/>
+          <w:i w:val="false"/>
+          <w:iCs w:val="false"/>
+          <w:caps w:val="false"/>
+          <w:color w:val="9C7728"/>
+          <w:sz w:val="15"/>
+          <w:szCs w:val="15"/>
+        </w:rPr>
+        <w:t xml:space="preserve">ZIEL  </w:t>
+      </w:r>
+      <w:r>
+        <w:rPr>
+          <w:rFonts w:ascii="Calibri" w:cs="Calibri" w:eastAsia="Calibri" w:hAnsi="Calibri"/>
+          <w:b w:val="false"/>
+          <w:bCs w:val="false"/>
+          <w:i w:val="false"/>
+          <w:iCs w:val="false"/>
+          <w:caps w:val="false"/>
+          <w:color w:val="231B27"/>
+          <w:sz w:val="18"/>
+          <w:szCs w:val="18"/>
+        </w:rPr>
+        <w:t xml:space="preserve">Gleicher Klang auf allen fünf Stufen. Wo der Vokal kippt oder eng wird, sitzt später die Enge im Stück.</w:t>
+      </w:r>
+    </w:p>
+    <w:p>
+      <w:pPr>
+        <w:pBdr>
+          <w:top w:val="none" w:color="FFFFFF" w:sz="0"/>
+          <w:bottom w:val="none" w:color="FFFFFF" w:sz="0"/>
+          <w:left w:val="single" w:color="7A2C63" w:sz="18"/>
+          <w:right w:val="none" w:color="FFFFFF" w:sz="0"/>
+        </w:pBdr>
+        <w:shd w:fill="F3E7EF" w:val="clear"/>
+        <w:spacing w:after="110" w:before="70" w:line="255"/>
+        <w:ind w:left="140" w:right="140"/>
+      </w:pPr>
+      <w:r>
+        <w:rPr>
+          <w:rFonts w:ascii="Consolas" w:cs="Consolas" w:eastAsia="Consolas" w:hAnsi="Consolas"/>
+          <w:b/>
+          <w:bCs/>
+          <w:i w:val="false"/>
+          <w:iCs w:val="false"/>
+          <w:caps w:val="false"/>
+          <w:color w:val="7A2C63"/>
+          <w:sz w:val="15"/>
+          <w:szCs w:val="15"/>
+        </w:rPr>
+        <w:t xml:space="preserve">ANSAGE  </w:t>
+      </w:r>
+      <w:r>
+        <w:rPr>
+          <w:rFonts w:ascii="Calibri" w:cs="Calibri" w:eastAsia="Calibri" w:hAnsi="Calibri"/>
+          <w:b w:val="false"/>
+          <w:bCs w:val="false"/>
+          <w:i/>
+          <w:iCs/>
+          <w:caps w:val="false"/>
+          <w:color w:val="231B27"/>
+          <w:sz w:val="18"/>
+          <w:szCs w:val="18"/>
+        </w:rPr>
+        <w:t xml:space="preserve">„Neun Töne, ein Atem, ein Vokal. Wenn der vierte anders klingt als der erste, habt ihr im Hals nachgeholfen.“</w:t>
+      </w:r>
+    </w:p>
+    <w:p>
+      <w:pPr>
+        <w:spacing w:after="60" w:before="180" w:line="255"/>
+      </w:pPr>
+      <w:r>
+        <w:rPr>
+          <w:rFonts w:ascii="Consolas" w:cs="Consolas" w:eastAsia="Consolas" w:hAnsi="Consolas"/>
+          <w:b/>
+          <w:bCs/>
+          <w:i w:val="false"/>
+          <w:iCs w:val="false"/>
+          <w:caps w:val="false"/>
+          <w:color w:val="7A2C63"/>
+          <w:sz w:val="19"/>
+          <w:szCs w:val="19"/>
+        </w:rPr>
+        <w:t xml:space="preserve">A5   </w:t>
+      </w:r>
+      <w:r>
+        <w:rPr>
+          <w:rFonts w:ascii="Calibri" w:cs="Calibri" w:eastAsia="Calibri" w:hAnsi="Calibri"/>
+          <w:b/>
+          <w:bCs/>
+          <w:i w:val="false"/>
+          <w:iCs w:val="false"/>
+          <w:caps w:val="false"/>
+          <w:color w:val="231B27"/>
+          <w:sz w:val="21"/>
+          <w:szCs w:val="21"/>
+        </w:rPr>
+        <w:t xml:space="preserve">Zurück zum Text, mit Konsonanten</w:t>
+      </w:r>
+      <w:r>
+        <w:rPr>
+          <w:rFonts w:ascii="Consolas" w:cs="Consolas" w:eastAsia="Consolas" w:hAnsi="Consolas"/>
+          <w:b w:val="false"/>
+          <w:bCs w:val="false"/>
+          <w:i w:val="false"/>
+          <w:iCs w:val="false"/>
+          <w:caps w:val="false"/>
+          <w:color w:val="584C5D"/>
+          <w:sz w:val="17"/>
+          <w:szCs w:val="17"/>
+        </w:rPr>
         <w:t xml:space="preserve">      2 Min.</w:t>
       </w:r>
     </w:p>
@@ -1128,7 +1563,7 @@
           <w:sz w:val="19"/>
           <w:szCs w:val="19"/>
         </w:rPr>
-        <w:t xml:space="preserve">Jetzt die echten Worte, auf denselben Stufen:</w:t>
+        <w:t xml:space="preserve">Zum Schluss wieder die Originalfigur, jetzt mit Blick auf die Konsonanten:</w:t>
       </w:r>
     </w:p>
     <w:p>
@@ -1155,34 +1590,7 @@
           <w:sz w:val="18"/>
           <w:szCs w:val="18"/>
         </w:rPr>
-        <w:t xml:space="preserve"> Stufe:   1      2      3    │    4  ————————  3</w:t>
-      </w:r>
-    </w:p>
-    <w:p>
-      <w:pPr>
-        <w:pBdr>
-          <w:top w:val="none" w:color="FFFFFF" w:sz="0"/>
-          <w:bottom w:val="none" w:color="FFFFFF" w:sz="0"/>
-          <w:left w:val="single" w:color="7A2C63" w:sz="18"/>
-          <w:right w:val="none" w:color="FFFFFF" w:sz="0"/>
-        </w:pBdr>
-        <w:shd w:fill="F0EBEF" w:val="clear"/>
-        <w:spacing w:after="0" w:before="0" w:line="250"/>
-        <w:ind w:left="140" w:right="140"/>
-      </w:pPr>
-      <w:r>
-        <w:rPr>
-          <w:rFonts w:ascii="Consolas" w:cs="Consolas" w:eastAsia="Consolas" w:hAnsi="Consolas"/>
-          <w:b w:val="false"/>
-          <w:bCs w:val="false"/>
-          <w:i w:val="false"/>
-          <w:iCs w:val="false"/>
-          <w:caps w:val="false"/>
-          <w:color w:val="231B27"/>
-          <w:sz w:val="18"/>
-          <w:szCs w:val="18"/>
-        </w:rPr>
-        <w:t xml:space="preserve">          ♩      ♩      ♩         ♩—           ♩ ‿ ♩</w:t>
+        <w:t xml:space="preserve">Stufe   1     1     2    │    3           2  ‿  3</w:t>
       </w:r>
     </w:p>
     <w:p>
@@ -1209,7 +1617,7 @@
           <w:sz w:val="18"/>
           <w:szCs w:val="18"/>
         </w:rPr>
-        <w:t xml:space="preserve">        When     I    sur-       vey         the  ——</w:t>
+        <w:t xml:space="preserve">       When    I    sur-      vey         the ————</w:t>
       </w:r>
     </w:p>
     <w:p>
@@ -2539,21 +2947,21 @@
           <w:sz w:val="18"/>
           <w:szCs w:val="18"/>
         </w:rPr>
-        <w:t xml:space="preserve">5′   </w:t>
-      </w:r>
-      <w:r>
-        <w:rPr>
-          <w:rFonts w:ascii="Calibri" w:cs="Calibri" w:eastAsia="Calibri" w:hAnsi="Calibri"/>
-          <w:b w:val="false"/>
-          <w:bCs w:val="false"/>
-          <w:i w:val="false"/>
-          <w:iCs w:val="false"/>
-          <w:caps w:val="false"/>
-          <w:color w:val="231B27"/>
-          <w:sz w:val="19"/>
-          <w:szCs w:val="19"/>
-        </w:rPr>
-        <w:t xml:space="preserve">A3 — Fünftonleiter legato, halbtonweise; so anlegen, dass der letzte Durchgang auf A-Dur landet</w:t>
+        <w:t xml:space="preserve">3′   </w:t>
+      </w:r>
+      <w:r>
+        <w:rPr>
+          <w:rFonts w:ascii="Calibri" w:cs="Calibri" w:eastAsia="Calibri" w:hAnsi="Calibri"/>
+          <w:b w:val="false"/>
+          <w:bCs w:val="false"/>
+          <w:i w:val="false"/>
+          <w:iCs w:val="false"/>
+          <w:caps w:val="false"/>
+          <w:color w:val="231B27"/>
+          <w:sz w:val="19"/>
+          <w:szCs w:val="19"/>
+        </w:rPr>
+        <w:t xml:space="preserve">A2 — Das Original in D-Dur: Männer wie notiert, Frauen eine Oktave höher, ohne Noten</w:t>
       </w:r>
     </w:p>
     <w:p>
@@ -2586,6 +2994,39 @@
           <w:sz w:val="19"/>
           <w:szCs w:val="19"/>
         </w:rPr>
+        <w:t xml:space="preserve">A3 — dieselbe Figur halbtonweise aufwärts, bis etwa G</w:t>
+      </w:r>
+    </w:p>
+    <w:p>
+      <w:pPr>
+        <w:spacing w:after="60" w:before="0" w:line="255"/>
+      </w:pPr>
+      <w:r>
+        <w:rPr>
+          <w:rFonts w:ascii="Consolas" w:cs="Consolas" w:eastAsia="Consolas" w:hAnsi="Consolas"/>
+          <w:b/>
+          <w:bCs/>
+          <w:i w:val="false"/>
+          <w:iCs w:val="false"/>
+          <w:caps w:val="false"/>
+          <w:color w:val="7A2C63"/>
+          <w:sz w:val="18"/>
+          <w:szCs w:val="18"/>
+        </w:rPr>
+        <w:t xml:space="preserve">2′   </w:t>
+      </w:r>
+      <w:r>
+        <w:rPr>
+          <w:rFonts w:ascii="Calibri" w:cs="Calibri" w:eastAsia="Calibri" w:hAnsi="Calibri"/>
+          <w:b w:val="false"/>
+          <w:bCs w:val="false"/>
+          <w:i w:val="false"/>
+          <w:iCs w:val="false"/>
+          <w:caps w:val="false"/>
+          <w:color w:val="231B27"/>
+          <w:sz w:val="19"/>
+          <w:szCs w:val="19"/>
+        </w:rPr>
         <w:t xml:space="preserve">B1 — Händel-Rhythmus gesprochen, mit Klatschen</w:t>
       </w:r>
     </w:p>
@@ -2652,7 +3093,7 @@
           <w:sz w:val="19"/>
           <w:szCs w:val="19"/>
         </w:rPr>
-        <w:t xml:space="preserve">A2 — zurück zur Ruhe: der Bogen auf einem Ton, in A-Dur, und zwar zuerst nur Tenor und Bass</w:t>
+        <w:t xml:space="preserve">A3 — noch einmal die Figur, jetzt abwärts bis A-Dur, und zwar zuerst nur Tenor und Bass</w:t>
       </w:r>
     </w:p>
     <w:p>
@@ -2679,21 +3120,21 @@
           <w:sz w:val="19"/>
           <w:szCs w:val="19"/>
         </w:rPr>
-        <w:t xml:space="preserve">Der letzte Baustein ist schon die Probe. </w:t>
-      </w:r>
-      <w:r>
-        <w:rPr>
-          <w:rFonts w:ascii="Calibri" w:cs="Calibri" w:eastAsia="Calibri" w:hAnsi="Calibri"/>
-          <w:b w:val="false"/>
-          <w:bCs w:val="false"/>
-          <w:i w:val="false"/>
-          <w:iCs w:val="false"/>
-          <w:caps w:val="false"/>
-          <w:color w:val="231B27"/>
-          <w:sz w:val="19"/>
-          <w:szCs w:val="19"/>
-        </w:rPr>
-        <w:t xml:space="preserve">Wenn die letzten zwei Minuten des Einsingens Tenor und Bass allein in A-Dur singen, ist der Männereinsatz in Takt 3 von Nr. 6 bereits vorbereitet — ohne dass jemand die Noten aufgeschlagen hat.</w:t>
+        <w:t xml:space="preserve">Zwei Dinge passieren dabei nebenbei. </w:t>
+      </w:r>
+      <w:r>
+        <w:rPr>
+          <w:rFonts w:ascii="Calibri" w:cs="Calibri" w:eastAsia="Calibri" w:hAnsi="Calibri"/>
+          <w:b w:val="false"/>
+          <w:bCs w:val="false"/>
+          <w:i w:val="false"/>
+          <w:iCs w:val="false"/>
+          <w:caps w:val="false"/>
+          <w:color w:val="231B27"/>
+          <w:sz w:val="19"/>
+          <w:szCs w:val="19"/>
+        </w:rPr>
+        <w:t xml:space="preserve">Erstens sind die ersten Töne von Nr. 11 im Ohr, bevor das Stück am Nachmittag überhaupt aufgeschlagen wird. Zweitens: Wenn die letzten zwei Minuten in A-Dur laufen und nur die Männer singen, ist der Männereinsatz in Takt 3 von Nr. 6 vorbereitet — ohne eine einzige Ansage.</w:t>
       </w:r>
     </w:p>
     <w:p>

</xml_diff>